<commit_message>
chore: refactor folder structure
</commit_message>
<xml_diff>
--- a/docs/paper/review/Review_GonzalezJ_et_al_response.docx
+++ b/docs/paper/review/Review_GonzalezJ_et_al_response.docx
@@ -2,7 +2,1839 @@
 <file path=word/document.xml><?xml version="1.0" encoding="utf-8"?>
 <w:document xmlns:wpc="http://schemas.microsoft.com/office/word/2010/wordprocessingCanvas" xmlns:cx="http://schemas.microsoft.com/office/drawing/2014/chartex" xmlns:cx1="http://schemas.microsoft.com/office/drawing/2015/9/8/chartex" xmlns:cx2="http://schemas.microsoft.com/office/drawing/2015/10/21/chartex" xmlns:cx3="http://schemas.microsoft.com/office/drawing/2016/5/9/chartex" xmlns:cx4="http://schemas.microsoft.com/office/drawing/2016/5/10/chartex" xmlns:cx5="http://schemas.microsoft.com/office/drawing/2016/5/11/chartex" xmlns:cx6="http://schemas.microsoft.com/office/drawing/2016/5/12/chartex" xmlns:cx7="http://schemas.microsoft.com/office/drawing/2016/5/13/chartex" xmlns:cx8="http://schemas.microsoft.com/office/drawing/2016/5/14/chartex" xmlns:mc="http://schemas.openxmlformats.org/markup-compatibility/2006" xmlns:aink="http://schemas.microsoft.com/office/drawing/2016/ink" xmlns:am3d="http://schemas.microsoft.com/office/drawing/2017/model3d" xmlns:o="urn:schemas-microsoft-com:office:office" xmlns:oel="http://schemas.microsoft.com/office/2019/extlst" xmlns:r="http://schemas.openxmlformats.org/officeDocument/2006/relationships" xmlns:m="http://schemas.openxmlformats.org/officeDocument/2006/math" xmlns:v="urn:schemas-microsoft-com:vml" xmlns:wp14="http://schemas.microsoft.com/office/word/2010/wordprocessingDrawing" xmlns:wp="http://schemas.openxmlformats.org/drawingml/2006/wordprocessingDrawing" xmlns:w10="urn:schemas-microsoft-com:office:word" xmlns:w="http://schemas.openxmlformats.org/wordprocessingml/2006/main" xmlns:w14="http://schemas.microsoft.com/office/word/2010/wordml" xmlns:w15="http://schemas.microsoft.com/office/word/2012/wordml" xmlns:w16cex="http://schemas.microsoft.com/office/word/2018/wordml/cex" xmlns:w16cid="http://schemas.microsoft.com/office/word/2016/wordml/cid" xmlns:w16="http://schemas.microsoft.com/office/word/2018/wordml" xmlns:w16du="http://schemas.microsoft.com/office/word/2023/wordml/word16du" xmlns:w16sdtdh="http://schemas.microsoft.com/office/word/2020/wordml/sdtdatahash" xmlns:w16sdtfl="http://schemas.microsoft.com/office/word/2024/wordml/sdtformatlock" xmlns:w16se="http://schemas.microsoft.com/office/word/2015/wordml/symex" xmlns:wpg="http://schemas.microsoft.com/office/word/2010/wordprocessingGroup" xmlns:wpi="http://schemas.microsoft.com/office/word/2010/wordprocessingInk" xmlns:wne="http://schemas.microsoft.com/office/word/2006/wordml" xmlns:wps="http://schemas.microsoft.com/office/word/2010/wordprocessingShape" mc:Ignorable="w14 w15 w16se w16cid w16 w16cex w16sdtdh w16sdtfl w16du wp14">
   <w:body>
-    <w:p/>
+    <w:p>
+      <w:pPr>
+        <w:jc w:val="both"/>
+        <w:rPr>
+          <w:rFonts w:ascii="Arial" w:hAnsi="Arial" w:cs="Arial"/>
+          <w:b/>
+          <w:bCs/>
+          <w:sz w:val="36"/>
+          <w:szCs w:val="36"/>
+          <w:lang w:val="en-US"/>
+        </w:rPr>
+      </w:pPr>
+      <w:r>
+        <w:rPr>
+          <w:rFonts w:ascii="Arial" w:hAnsi="Arial" w:cs="Arial"/>
+          <w:b/>
+          <w:bCs/>
+          <w:sz w:val="36"/>
+          <w:szCs w:val="36"/>
+          <w:lang w:val="en-US"/>
+        </w:rPr>
+        <w:t>Response to Reviewers</w:t>
+      </w:r>
+    </w:p>
+    <w:p>
+      <w:pPr>
+        <w:rPr>
+          <w:rFonts w:ascii="Arial" w:hAnsi="Arial" w:cs="Arial"/>
+          <w:b/>
+          <w:bCs/>
+          <w:lang w:val="en-US"/>
+        </w:rPr>
+      </w:pPr>
+      <w:r>
+        <w:rPr>
+          <w:rFonts w:ascii="Arial" w:hAnsi="Arial" w:cs="Arial"/>
+          <w:b/>
+          <w:bCs/>
+          <w:lang w:val="en-US"/>
+        </w:rPr>
+        <w:t>Manuscript: </w:t>
+      </w:r>
+      <w:r>
+        <w:rPr>
+          <w:rFonts w:ascii="Arial" w:hAnsi="Arial" w:cs="Arial"/>
+          <w:lang w:val="en-US"/>
+        </w:rPr>
+        <w:t>"Advanced Machine Learning Strategies for Predicting Therapy Response in Preclinical Glioblastoma using Longitudinal MRI"</w:t>
+      </w:r>
+      <w:r>
+        <w:rPr>
+          <w:rFonts w:ascii="Arial" w:hAnsi="Arial" w:cs="Arial"/>
+          <w:lang w:val="en-US"/>
+        </w:rPr>
+        <w:br/>
+      </w:r>
+      <w:r>
+        <w:rPr>
+          <w:rFonts w:ascii="Arial" w:hAnsi="Arial" w:cs="Arial"/>
+          <w:b/>
+          <w:bCs/>
+          <w:lang w:val="en-US"/>
+        </w:rPr>
+        <w:t>Journal: </w:t>
+      </w:r>
+      <w:r>
+        <w:rPr>
+          <w:rFonts w:ascii="Arial" w:hAnsi="Arial" w:cs="Arial"/>
+          <w:lang w:val="en-US"/>
+        </w:rPr>
+        <w:t>Scientific Reports</w:t>
+      </w:r>
+      <w:r>
+        <w:rPr>
+          <w:rFonts w:ascii="Arial" w:hAnsi="Arial" w:cs="Arial"/>
+          <w:b/>
+          <w:bCs/>
+          <w:lang w:val="en-US"/>
+        </w:rPr>
+        <w:br/>
+        <w:t>Decision: </w:t>
+      </w:r>
+      <w:r>
+        <w:rPr>
+          <w:rFonts w:ascii="Arial" w:hAnsi="Arial" w:cs="Arial"/>
+          <w:lang w:val="en-US"/>
+        </w:rPr>
+        <w:t>Major Revision</w:t>
+      </w:r>
+    </w:p>
+    <w:p>
+      <w:pPr>
+        <w:jc w:val="both"/>
+        <w:rPr>
+          <w:rFonts w:ascii="Arial" w:hAnsi="Arial" w:cs="Arial"/>
+          <w:lang w:val="en-US"/>
+        </w:rPr>
+      </w:pPr>
+      <w:r>
+        <w:rPr>
+          <w:rFonts w:ascii="Arial" w:hAnsi="Arial" w:cs="Arial"/>
+          <w:lang w:val="en-US"/>
+        </w:rPr>
+        <w:t>We thank the reviewers for their thorough and constructive evaluation. All major and minor comments have been addressed. Changes to the manuscript are described below; modified passages are indicated in bold in the revised manuscript.</w:t>
+      </w:r>
+    </w:p>
+    <w:p>
+      <w:pPr>
+        <w:jc w:val="both"/>
+        <w:rPr>
+          <w:rFonts w:ascii="Arial" w:hAnsi="Arial" w:cs="Arial"/>
+          <w:b/>
+          <w:bCs/>
+          <w:lang w:val="en-US"/>
+        </w:rPr>
+      </w:pPr>
+      <w:r>
+        <w:rPr>
+          <w:rFonts w:ascii="Arial" w:hAnsi="Arial" w:cs="Arial"/>
+          <w:b/>
+          <w:bCs/>
+          <w:lang w:val="en-US"/>
+        </w:rPr>
+        <w:t xml:space="preserve">Major comments: </w:t>
+      </w:r>
+    </w:p>
+    <w:p>
+      <w:pPr>
+        <w:jc w:val="both"/>
+        <w:rPr>
+          <w:rFonts w:ascii="Arial" w:hAnsi="Arial" w:cs="Arial"/>
+          <w:b/>
+          <w:bCs/>
+          <w:lang w:val="en-US"/>
+        </w:rPr>
+      </w:pPr>
+      <w:r>
+        <w:rPr>
+          <w:rFonts w:ascii="Arial" w:hAnsi="Arial" w:cs="Arial"/>
+          <w:b/>
+          <w:bCs/>
+          <w:lang w:val="en-US"/>
+        </w:rPr>
+        <w:t>1. Would you be able to clarify if the model development pipeline was performed within the training portion of each subject level cross-</w:t>
+      </w:r>
+      <w:proofErr w:type="spellStart"/>
+      <w:r>
+        <w:rPr>
+          <w:rFonts w:ascii="Arial" w:hAnsi="Arial" w:cs="Arial"/>
+          <w:b/>
+          <w:bCs/>
+          <w:lang w:val="en-US"/>
+        </w:rPr>
+        <w:t>val</w:t>
+      </w:r>
+      <w:proofErr w:type="spellEnd"/>
+      <w:r>
+        <w:rPr>
+          <w:rFonts w:ascii="Arial" w:hAnsi="Arial" w:cs="Arial"/>
+          <w:b/>
+          <w:bCs/>
+          <w:lang w:val="en-US"/>
+        </w:rPr>
+        <w:t xml:space="preserve"> fold? </w:t>
+      </w:r>
+    </w:p>
+    <w:p>
+      <w:pPr>
+        <w:jc w:val="both"/>
+        <w:rPr>
+          <w:rFonts w:ascii="Arial" w:hAnsi="Arial" w:cs="Arial"/>
+          <w:lang w:val="en-US"/>
+        </w:rPr>
+      </w:pPr>
+      <w:r>
+        <w:rPr>
+          <w:rFonts w:ascii="Arial" w:hAnsi="Arial" w:cs="Arial"/>
+          <w:lang w:val="en-US"/>
+        </w:rPr>
+        <w:t xml:space="preserve">- I do like that the author used GLOO CV with all exams from one mouse withheld together. That said, in the radiomics-based pipeline, the manuscript did not sufficiently specify if their statistical analysis and feature selection steps (correlation filtering, Mann-Whitney U test step, temporal feature engineering) were refitted using only the training animals within GLOO folds. Please explicitly clarify this, especially for the feature selection step. If any of these preprocessing was performed before GLOO CVs splits, I recommend that the analysis be repeated using a fully nested subject-level procedure. </w:t>
+      </w:r>
+    </w:p>
+    <w:p>
+      <w:pPr>
+        <w:jc w:val="both"/>
+        <w:rPr>
+          <w:rFonts w:ascii="Arial" w:hAnsi="Arial" w:cs="Arial"/>
+          <w:b/>
+          <w:bCs/>
+          <w:color w:val="0A2F41" w:themeColor="accent1" w:themeShade="80"/>
+          <w:lang w:val="en-US"/>
+        </w:rPr>
+      </w:pPr>
+      <w:r>
+        <w:rPr>
+          <w:rFonts w:ascii="Arial" w:hAnsi="Arial" w:cs="Arial"/>
+          <w:b/>
+          <w:bCs/>
+          <w:color w:val="0A2F41" w:themeColor="accent1" w:themeShade="80"/>
+          <w:lang w:val="en-US"/>
+        </w:rPr>
+        <w:t>Author response:</w:t>
+      </w:r>
+    </w:p>
+    <w:p>
+      <w:pPr>
+        <w:jc w:val="both"/>
+        <w:rPr>
+          <w:rFonts w:ascii="Arial" w:hAnsi="Arial" w:cs="Arial"/>
+          <w:color w:val="0A2F41" w:themeColor="accent1" w:themeShade="80"/>
+          <w:lang w:val="en-US"/>
+        </w:rPr>
+      </w:pPr>
+      <w:r>
+        <w:rPr>
+          <w:rFonts w:ascii="Arial" w:hAnsi="Arial" w:cs="Arial"/>
+          <w:color w:val="0A2F41" w:themeColor="accent1" w:themeShade="80"/>
+          <w:lang w:val="en-US"/>
+        </w:rPr>
+        <w:t xml:space="preserve">After inspecting the code, we confirmed that feature selection in the original implementation was performed </w:t>
+      </w:r>
+      <w:r>
+        <w:rPr>
+          <w:rFonts w:ascii="Arial" w:hAnsi="Arial" w:cs="Arial"/>
+          <w:b/>
+          <w:bCs/>
+          <w:color w:val="0A2F41" w:themeColor="accent1" w:themeShade="80"/>
+          <w:lang w:val="en-US"/>
+        </w:rPr>
+        <w:t>before</w:t>
+      </w:r>
+      <w:r>
+        <w:rPr>
+          <w:rFonts w:ascii="Arial" w:hAnsi="Arial" w:cs="Arial"/>
+          <w:color w:val="0A2F41" w:themeColor="accent1" w:themeShade="80"/>
+          <w:lang w:val="en-US"/>
+        </w:rPr>
+        <w:t xml:space="preserve"> the GLOO loop on the full dataset, which constitutes data leakage from the held-</w:t>
+      </w:r>
+      <w:proofErr w:type="gramStart"/>
+      <w:r>
+        <w:rPr>
+          <w:rFonts w:ascii="Arial" w:hAnsi="Arial" w:cs="Arial"/>
+          <w:color w:val="0A2F41" w:themeColor="accent1" w:themeShade="80"/>
+          <w:lang w:val="en-US"/>
+        </w:rPr>
+        <w:t>out test</w:t>
+      </w:r>
+      <w:proofErr w:type="gramEnd"/>
+      <w:r>
+        <w:rPr>
+          <w:rFonts w:ascii="Arial" w:hAnsi="Arial" w:cs="Arial"/>
+          <w:color w:val="0A2F41" w:themeColor="accent1" w:themeShade="80"/>
+          <w:lang w:val="en-US"/>
+        </w:rPr>
+        <w:t xml:space="preserve"> animal into the feature selection step.</w:t>
+      </w:r>
+    </w:p>
+    <w:p>
+      <w:pPr>
+        <w:jc w:val="both"/>
+        <w:rPr>
+          <w:rFonts w:ascii="Arial" w:hAnsi="Arial" w:cs="Arial"/>
+          <w:color w:val="0A2F41" w:themeColor="accent1" w:themeShade="80"/>
+          <w:lang w:val="en-US"/>
+        </w:rPr>
+      </w:pPr>
+      <w:r>
+        <w:rPr>
+          <w:rFonts w:ascii="Arial" w:hAnsi="Arial" w:cs="Arial"/>
+          <w:color w:val="0A2F41" w:themeColor="accent1" w:themeShade="80"/>
+          <w:lang w:val="en-US"/>
+        </w:rPr>
+        <w:t>We have fully re-implemented the pipeline so that the complete feature selection sequence — (1) heuristic filter retaining only `original_` image-derived features, (2) variance filter (var &lt; 0.01), (3) Spearman correlation deduplication (|</w:t>
+      </w:r>
+      <w:r>
+        <w:rPr>
+          <w:rFonts w:ascii="Arial" w:hAnsi="Arial" w:cs="Arial"/>
+          <w:color w:val="0A2F41" w:themeColor="accent1" w:themeShade="80"/>
+        </w:rPr>
+        <w:t>ρ</w:t>
+      </w:r>
+      <w:r>
+        <w:rPr>
+          <w:rFonts w:ascii="Arial" w:hAnsi="Arial" w:cs="Arial"/>
+          <w:color w:val="0A2F41" w:themeColor="accent1" w:themeShade="80"/>
+          <w:lang w:val="en-US"/>
+        </w:rPr>
+        <w:t xml:space="preserve">| &gt; 0.95), and (4) Mann–Whitney U test (p &gt; 0.05, two-sided) — is applied </w:t>
+      </w:r>
+      <w:r>
+        <w:rPr>
+          <w:rFonts w:ascii="Arial" w:hAnsi="Arial" w:cs="Arial"/>
+          <w:b/>
+          <w:bCs/>
+          <w:color w:val="0A2F41" w:themeColor="accent1" w:themeShade="80"/>
+          <w:lang w:val="en-US"/>
+        </w:rPr>
+        <w:t>exclusively within the training partition of each GLOO fold</w:t>
+      </w:r>
+      <w:r>
+        <w:rPr>
+          <w:rFonts w:ascii="Arial" w:hAnsi="Arial" w:cs="Arial"/>
+          <w:color w:val="0A2F41" w:themeColor="accent1" w:themeShade="80"/>
+          <w:lang w:val="en-US"/>
+        </w:rPr>
+        <w:t xml:space="preserve">. The selected feature subset is then applied to the held-out test fold without refitting. </w:t>
+      </w:r>
+      <w:proofErr w:type="spellStart"/>
+      <w:r>
+        <w:rPr>
+          <w:rFonts w:ascii="Arial" w:hAnsi="Arial" w:cs="Arial"/>
+          <w:color w:val="0A2F41" w:themeColor="accent1" w:themeShade="80"/>
+          <w:lang w:val="en-US"/>
+        </w:rPr>
+        <w:t>StandardScaler</w:t>
+      </w:r>
+      <w:proofErr w:type="spellEnd"/>
+      <w:r>
+        <w:rPr>
+          <w:rFonts w:ascii="Arial" w:hAnsi="Arial" w:cs="Arial"/>
+          <w:color w:val="0A2F41" w:themeColor="accent1" w:themeShade="80"/>
+          <w:lang w:val="en-US"/>
+        </w:rPr>
+        <w:t xml:space="preserve"> </w:t>
+      </w:r>
+      <w:proofErr w:type="spellStart"/>
+      <w:r>
+        <w:rPr>
+          <w:rFonts w:ascii="Arial" w:hAnsi="Arial" w:cs="Arial"/>
+          <w:color w:val="0A2F41" w:themeColor="accent1" w:themeShade="80"/>
+          <w:lang w:val="en-US"/>
+        </w:rPr>
+        <w:t>normalisation</w:t>
+      </w:r>
+      <w:proofErr w:type="spellEnd"/>
+      <w:r>
+        <w:rPr>
+          <w:rFonts w:ascii="Arial" w:hAnsi="Arial" w:cs="Arial"/>
+          <w:color w:val="0A2F41" w:themeColor="accent1" w:themeShade="80"/>
+          <w:lang w:val="en-US"/>
+        </w:rPr>
+        <w:t xml:space="preserve"> and SMOTE oversampling are likewise fitted on training data only, as was the case in the original implementation.</w:t>
+      </w:r>
+    </w:p>
+    <w:p>
+      <w:pPr>
+        <w:jc w:val="both"/>
+        <w:rPr>
+          <w:rFonts w:ascii="Arial" w:hAnsi="Arial" w:cs="Arial"/>
+          <w:color w:val="0A2F41" w:themeColor="accent1" w:themeShade="80"/>
+          <w:lang w:val="en-US"/>
+        </w:rPr>
+      </w:pPr>
+      <w:r>
+        <w:rPr>
+          <w:rFonts w:ascii="Arial" w:hAnsi="Arial" w:cs="Arial"/>
+          <w:color w:val="0A2F41" w:themeColor="accent1" w:themeShade="80"/>
+          <w:lang w:val="en-US"/>
+        </w:rPr>
+        <w:t>Results have changed as follows:</w:t>
+      </w:r>
+    </w:p>
+    <w:tbl>
+      <w:tblPr>
+        <w:tblW w:w="9633" w:type="dxa"/>
+        <w:tblInd w:w="-1671" w:type="dxa"/>
+        <w:shd w:val="clear" w:color="auto" w:fill="FFFFFF"/>
+        <w:tblCellMar>
+          <w:top w:w="15" w:type="dxa"/>
+          <w:left w:w="15" w:type="dxa"/>
+          <w:bottom w:w="15" w:type="dxa"/>
+          <w:right w:w="15" w:type="dxa"/>
+        </w:tblCellMar>
+        <w:tblLook w:val="04A0" w:firstRow="1" w:lastRow="0" w:firstColumn="1" w:lastColumn="0" w:noHBand="0" w:noVBand="1"/>
+      </w:tblPr>
+      <w:tblGrid>
+        <w:gridCol w:w="1611"/>
+        <w:gridCol w:w="1187"/>
+        <w:gridCol w:w="1697"/>
+        <w:gridCol w:w="1220"/>
+        <w:gridCol w:w="1959"/>
+        <w:gridCol w:w="1959"/>
+      </w:tblGrid>
+      <w:tr>
+        <w:trPr>
+          <w:trHeight w:val="404"/>
+          <w:tblHeader/>
+        </w:trPr>
+        <w:tc>
+          <w:tcPr>
+            <w:tcW w:w="0" w:type="auto"/>
+            <w:tcBorders>
+              <w:top w:val="single" w:sz="6" w:space="0" w:color="D6D6D6"/>
+              <w:left w:val="single" w:sz="6" w:space="0" w:color="D6D6D6"/>
+              <w:bottom w:val="single" w:sz="6" w:space="0" w:color="D6D6D6"/>
+              <w:right w:val="single" w:sz="6" w:space="0" w:color="D6D6D6"/>
+            </w:tcBorders>
+            <w:shd w:val="clear" w:color="auto" w:fill="FFFFFF"/>
+            <w:tcMar>
+              <w:top w:w="90" w:type="dxa"/>
+              <w:left w:w="195" w:type="dxa"/>
+              <w:bottom w:w="90" w:type="dxa"/>
+              <w:right w:w="195" w:type="dxa"/>
+            </w:tcMar>
+            <w:vAlign w:val="center"/>
+            <w:hideMark/>
+          </w:tcPr>
+          <w:p>
+            <w:pPr>
+              <w:jc w:val="both"/>
+              <w:rPr>
+                <w:rFonts w:ascii="Arial" w:hAnsi="Arial" w:cs="Arial"/>
+                <w:b/>
+                <w:bCs/>
+                <w:color w:val="0A2F41" w:themeColor="accent1" w:themeShade="80"/>
+              </w:rPr>
+            </w:pPr>
+            <w:r>
+              <w:rPr>
+                <w:rFonts w:ascii="Arial" w:hAnsi="Arial" w:cs="Arial"/>
+                <w:b/>
+                <w:bCs/>
+                <w:color w:val="0A2F41" w:themeColor="accent1" w:themeShade="80"/>
+              </w:rPr>
+              <w:t>Window</w:t>
+            </w:r>
+          </w:p>
+        </w:tc>
+        <w:tc>
+          <w:tcPr>
+            <w:tcW w:w="0" w:type="auto"/>
+            <w:tcBorders>
+              <w:top w:val="single" w:sz="6" w:space="0" w:color="D6D6D6"/>
+              <w:left w:val="single" w:sz="6" w:space="0" w:color="D6D6D6"/>
+              <w:bottom w:val="single" w:sz="6" w:space="0" w:color="D6D6D6"/>
+              <w:right w:val="single" w:sz="6" w:space="0" w:color="D6D6D6"/>
+            </w:tcBorders>
+            <w:shd w:val="clear" w:color="auto" w:fill="FFFFFF"/>
+            <w:tcMar>
+              <w:top w:w="90" w:type="dxa"/>
+              <w:left w:w="195" w:type="dxa"/>
+              <w:bottom w:w="90" w:type="dxa"/>
+              <w:right w:w="195" w:type="dxa"/>
+            </w:tcMar>
+            <w:vAlign w:val="center"/>
+            <w:hideMark/>
+          </w:tcPr>
+          <w:p>
+            <w:pPr>
+              <w:jc w:val="both"/>
+              <w:rPr>
+                <w:rFonts w:ascii="Arial" w:hAnsi="Arial" w:cs="Arial"/>
+                <w:b/>
+                <w:bCs/>
+                <w:color w:val="0A2F41" w:themeColor="accent1" w:themeShade="80"/>
+              </w:rPr>
+            </w:pPr>
+            <w:r>
+              <w:rPr>
+                <w:rFonts w:ascii="Arial" w:hAnsi="Arial" w:cs="Arial"/>
+                <w:b/>
+                <w:bCs/>
+                <w:color w:val="0A2F41" w:themeColor="accent1" w:themeShade="80"/>
+              </w:rPr>
+              <w:t>Days</w:t>
+            </w:r>
+          </w:p>
+        </w:tc>
+        <w:tc>
+          <w:tcPr>
+            <w:tcW w:w="0" w:type="auto"/>
+            <w:tcBorders>
+              <w:top w:val="single" w:sz="6" w:space="0" w:color="D6D6D6"/>
+              <w:left w:val="single" w:sz="6" w:space="0" w:color="D6D6D6"/>
+              <w:bottom w:val="single" w:sz="6" w:space="0" w:color="D6D6D6"/>
+              <w:right w:val="single" w:sz="6" w:space="0" w:color="D6D6D6"/>
+            </w:tcBorders>
+            <w:shd w:val="clear" w:color="auto" w:fill="FFFFFF"/>
+            <w:tcMar>
+              <w:top w:w="90" w:type="dxa"/>
+              <w:left w:w="195" w:type="dxa"/>
+              <w:bottom w:w="90" w:type="dxa"/>
+              <w:right w:w="195" w:type="dxa"/>
+            </w:tcMar>
+            <w:vAlign w:val="center"/>
+            <w:hideMark/>
+          </w:tcPr>
+          <w:p>
+            <w:pPr>
+              <w:jc w:val="both"/>
+              <w:rPr>
+                <w:rFonts w:ascii="Arial" w:hAnsi="Arial" w:cs="Arial"/>
+                <w:b/>
+                <w:bCs/>
+                <w:color w:val="0A2F41" w:themeColor="accent1" w:themeShade="80"/>
+              </w:rPr>
+            </w:pPr>
+            <w:r>
+              <w:rPr>
+                <w:rFonts w:ascii="Arial" w:hAnsi="Arial" w:cs="Arial"/>
+                <w:b/>
+                <w:bCs/>
+                <w:color w:val="0A2F41" w:themeColor="accent1" w:themeShade="80"/>
+              </w:rPr>
+              <w:t xml:space="preserve">N </w:t>
+            </w:r>
+            <w:proofErr w:type="spellStart"/>
+            <w:r>
+              <w:rPr>
+                <w:rFonts w:ascii="Arial" w:hAnsi="Arial" w:cs="Arial"/>
+                <w:b/>
+                <w:bCs/>
+                <w:color w:val="0A2F41" w:themeColor="accent1" w:themeShade="80"/>
+              </w:rPr>
+              <w:t>exams</w:t>
+            </w:r>
+            <w:proofErr w:type="spellEnd"/>
+          </w:p>
+        </w:tc>
+        <w:tc>
+          <w:tcPr>
+            <w:tcW w:w="0" w:type="auto"/>
+            <w:tcBorders>
+              <w:top w:val="single" w:sz="6" w:space="0" w:color="D6D6D6"/>
+              <w:left w:val="single" w:sz="6" w:space="0" w:color="D6D6D6"/>
+              <w:bottom w:val="single" w:sz="6" w:space="0" w:color="D6D6D6"/>
+              <w:right w:val="single" w:sz="6" w:space="0" w:color="D6D6D6"/>
+            </w:tcBorders>
+            <w:shd w:val="clear" w:color="auto" w:fill="FFFFFF"/>
+            <w:tcMar>
+              <w:top w:w="90" w:type="dxa"/>
+              <w:left w:w="195" w:type="dxa"/>
+              <w:bottom w:w="90" w:type="dxa"/>
+              <w:right w:w="195" w:type="dxa"/>
+            </w:tcMar>
+            <w:vAlign w:val="center"/>
+            <w:hideMark/>
+          </w:tcPr>
+          <w:p>
+            <w:pPr>
+              <w:jc w:val="both"/>
+              <w:rPr>
+                <w:rFonts w:ascii="Arial" w:hAnsi="Arial" w:cs="Arial"/>
+                <w:b/>
+                <w:bCs/>
+                <w:color w:val="0A2F41" w:themeColor="accent1" w:themeShade="80"/>
+              </w:rPr>
+            </w:pPr>
+            <w:r>
+              <w:rPr>
+                <w:rFonts w:ascii="Arial" w:hAnsi="Arial" w:cs="Arial"/>
+                <w:b/>
+                <w:bCs/>
+                <w:color w:val="0A2F41" w:themeColor="accent1" w:themeShade="80"/>
+              </w:rPr>
+              <w:t>AUC</w:t>
+            </w:r>
+          </w:p>
+        </w:tc>
+        <w:tc>
+          <w:tcPr>
+            <w:tcW w:w="0" w:type="auto"/>
+            <w:tcBorders>
+              <w:top w:val="single" w:sz="6" w:space="0" w:color="D6D6D6"/>
+              <w:left w:val="single" w:sz="6" w:space="0" w:color="D6D6D6"/>
+              <w:bottom w:val="single" w:sz="6" w:space="0" w:color="D6D6D6"/>
+              <w:right w:val="single" w:sz="6" w:space="0" w:color="D6D6D6"/>
+            </w:tcBorders>
+            <w:shd w:val="clear" w:color="auto" w:fill="FFFFFF"/>
+            <w:tcMar>
+              <w:top w:w="90" w:type="dxa"/>
+              <w:left w:w="195" w:type="dxa"/>
+              <w:bottom w:w="90" w:type="dxa"/>
+              <w:right w:w="195" w:type="dxa"/>
+            </w:tcMar>
+            <w:vAlign w:val="center"/>
+            <w:hideMark/>
+          </w:tcPr>
+          <w:p>
+            <w:pPr>
+              <w:jc w:val="both"/>
+              <w:rPr>
+                <w:rFonts w:ascii="Arial" w:hAnsi="Arial" w:cs="Arial"/>
+                <w:b/>
+                <w:bCs/>
+                <w:color w:val="0A2F41" w:themeColor="accent1" w:themeShade="80"/>
+              </w:rPr>
+            </w:pPr>
+            <w:proofErr w:type="spellStart"/>
+            <w:r>
+              <w:rPr>
+                <w:rFonts w:ascii="Arial" w:hAnsi="Arial" w:cs="Arial"/>
+                <w:b/>
+                <w:bCs/>
+                <w:color w:val="0A2F41" w:themeColor="accent1" w:themeShade="80"/>
+              </w:rPr>
+              <w:t>Sensitivity</w:t>
+            </w:r>
+            <w:proofErr w:type="spellEnd"/>
+          </w:p>
+        </w:tc>
+        <w:tc>
+          <w:tcPr>
+            <w:tcW w:w="0" w:type="auto"/>
+            <w:tcBorders>
+              <w:top w:val="single" w:sz="6" w:space="0" w:color="D6D6D6"/>
+              <w:left w:val="single" w:sz="6" w:space="0" w:color="D6D6D6"/>
+              <w:bottom w:val="single" w:sz="6" w:space="0" w:color="D6D6D6"/>
+              <w:right w:val="single" w:sz="6" w:space="0" w:color="D6D6D6"/>
+            </w:tcBorders>
+            <w:shd w:val="clear" w:color="auto" w:fill="FFFFFF"/>
+            <w:tcMar>
+              <w:top w:w="90" w:type="dxa"/>
+              <w:left w:w="195" w:type="dxa"/>
+              <w:bottom w:w="90" w:type="dxa"/>
+              <w:right w:w="195" w:type="dxa"/>
+            </w:tcMar>
+            <w:vAlign w:val="center"/>
+            <w:hideMark/>
+          </w:tcPr>
+          <w:p>
+            <w:pPr>
+              <w:jc w:val="both"/>
+              <w:rPr>
+                <w:rFonts w:ascii="Arial" w:hAnsi="Arial" w:cs="Arial"/>
+                <w:b/>
+                <w:bCs/>
+                <w:color w:val="0A2F41" w:themeColor="accent1" w:themeShade="80"/>
+              </w:rPr>
+            </w:pPr>
+            <w:proofErr w:type="spellStart"/>
+            <w:r>
+              <w:rPr>
+                <w:rFonts w:ascii="Arial" w:hAnsi="Arial" w:cs="Arial"/>
+                <w:b/>
+                <w:bCs/>
+                <w:color w:val="0A2F41" w:themeColor="accent1" w:themeShade="80"/>
+              </w:rPr>
+              <w:t>Specificity</w:t>
+            </w:r>
+            <w:proofErr w:type="spellEnd"/>
+          </w:p>
+        </w:tc>
+      </w:tr>
+      <w:tr>
+        <w:trPr>
+          <w:trHeight w:val="394"/>
+        </w:trPr>
+        <w:tc>
+          <w:tcPr>
+            <w:tcW w:w="0" w:type="auto"/>
+            <w:tcBorders>
+              <w:top w:val="single" w:sz="6" w:space="0" w:color="D6D6D6"/>
+              <w:left w:val="single" w:sz="6" w:space="0" w:color="D6D6D6"/>
+              <w:bottom w:val="single" w:sz="6" w:space="0" w:color="D6D6D6"/>
+              <w:right w:val="single" w:sz="6" w:space="0" w:color="D6D6D6"/>
+            </w:tcBorders>
+            <w:shd w:val="clear" w:color="auto" w:fill="FFFFFF"/>
+            <w:tcMar>
+              <w:top w:w="90" w:type="dxa"/>
+              <w:left w:w="195" w:type="dxa"/>
+              <w:bottom w:w="90" w:type="dxa"/>
+              <w:right w:w="195" w:type="dxa"/>
+            </w:tcMar>
+            <w:vAlign w:val="center"/>
+            <w:hideMark/>
+          </w:tcPr>
+          <w:p>
+            <w:pPr>
+              <w:jc w:val="both"/>
+              <w:rPr>
+                <w:rFonts w:ascii="Arial" w:hAnsi="Arial" w:cs="Arial"/>
+                <w:color w:val="0A2F41" w:themeColor="accent1" w:themeShade="80"/>
+              </w:rPr>
+            </w:pPr>
+            <w:r>
+              <w:rPr>
+                <w:rFonts w:ascii="Arial" w:hAnsi="Arial" w:cs="Arial"/>
+                <w:color w:val="0A2F41" w:themeColor="accent1" w:themeShade="80"/>
+              </w:rPr>
+              <w:t>Early</w:t>
+            </w:r>
+          </w:p>
+        </w:tc>
+        <w:tc>
+          <w:tcPr>
+            <w:tcW w:w="0" w:type="auto"/>
+            <w:tcBorders>
+              <w:top w:val="single" w:sz="6" w:space="0" w:color="D6D6D6"/>
+              <w:left w:val="single" w:sz="6" w:space="0" w:color="D6D6D6"/>
+              <w:bottom w:val="single" w:sz="6" w:space="0" w:color="D6D6D6"/>
+              <w:right w:val="single" w:sz="6" w:space="0" w:color="D6D6D6"/>
+            </w:tcBorders>
+            <w:shd w:val="clear" w:color="auto" w:fill="FFFFFF"/>
+            <w:tcMar>
+              <w:top w:w="90" w:type="dxa"/>
+              <w:left w:w="195" w:type="dxa"/>
+              <w:bottom w:w="90" w:type="dxa"/>
+              <w:right w:w="195" w:type="dxa"/>
+            </w:tcMar>
+            <w:vAlign w:val="center"/>
+            <w:hideMark/>
+          </w:tcPr>
+          <w:p>
+            <w:pPr>
+              <w:jc w:val="both"/>
+              <w:rPr>
+                <w:rFonts w:ascii="Arial" w:hAnsi="Arial" w:cs="Arial"/>
+                <w:color w:val="0A2F41" w:themeColor="accent1" w:themeShade="80"/>
+              </w:rPr>
+            </w:pPr>
+            <w:r>
+              <w:rPr>
+                <w:rFonts w:ascii="Arial" w:hAnsi="Arial" w:cs="Arial"/>
+                <w:color w:val="0A2F41" w:themeColor="accent1" w:themeShade="80"/>
+              </w:rPr>
+              <w:t>≤ 21</w:t>
+            </w:r>
+          </w:p>
+        </w:tc>
+        <w:tc>
+          <w:tcPr>
+            <w:tcW w:w="0" w:type="auto"/>
+            <w:tcBorders>
+              <w:top w:val="single" w:sz="6" w:space="0" w:color="D6D6D6"/>
+              <w:left w:val="single" w:sz="6" w:space="0" w:color="D6D6D6"/>
+              <w:bottom w:val="single" w:sz="6" w:space="0" w:color="D6D6D6"/>
+              <w:right w:val="single" w:sz="6" w:space="0" w:color="D6D6D6"/>
+            </w:tcBorders>
+            <w:shd w:val="clear" w:color="auto" w:fill="FFFFFF"/>
+            <w:tcMar>
+              <w:top w:w="90" w:type="dxa"/>
+              <w:left w:w="195" w:type="dxa"/>
+              <w:bottom w:w="90" w:type="dxa"/>
+              <w:right w:w="195" w:type="dxa"/>
+            </w:tcMar>
+            <w:vAlign w:val="center"/>
+            <w:hideMark/>
+          </w:tcPr>
+          <w:p>
+            <w:pPr>
+              <w:jc w:val="both"/>
+              <w:rPr>
+                <w:rFonts w:ascii="Arial" w:hAnsi="Arial" w:cs="Arial"/>
+                <w:color w:val="0A2F41" w:themeColor="accent1" w:themeShade="80"/>
+              </w:rPr>
+            </w:pPr>
+            <w:r>
+              <w:rPr>
+                <w:rFonts w:ascii="Arial" w:hAnsi="Arial" w:cs="Arial"/>
+                <w:color w:val="0A2F41" w:themeColor="accent1" w:themeShade="80"/>
+              </w:rPr>
+              <w:t>101</w:t>
+            </w:r>
+          </w:p>
+        </w:tc>
+        <w:tc>
+          <w:tcPr>
+            <w:tcW w:w="0" w:type="auto"/>
+            <w:tcBorders>
+              <w:top w:val="single" w:sz="6" w:space="0" w:color="D6D6D6"/>
+              <w:left w:val="single" w:sz="6" w:space="0" w:color="D6D6D6"/>
+              <w:bottom w:val="single" w:sz="6" w:space="0" w:color="D6D6D6"/>
+              <w:right w:val="single" w:sz="6" w:space="0" w:color="D6D6D6"/>
+            </w:tcBorders>
+            <w:shd w:val="clear" w:color="auto" w:fill="FFFFFF"/>
+            <w:tcMar>
+              <w:top w:w="90" w:type="dxa"/>
+              <w:left w:w="195" w:type="dxa"/>
+              <w:bottom w:w="90" w:type="dxa"/>
+              <w:right w:w="195" w:type="dxa"/>
+            </w:tcMar>
+            <w:vAlign w:val="center"/>
+            <w:hideMark/>
+          </w:tcPr>
+          <w:p>
+            <w:pPr>
+              <w:jc w:val="both"/>
+              <w:rPr>
+                <w:rFonts w:ascii="Arial" w:hAnsi="Arial" w:cs="Arial"/>
+                <w:color w:val="0A2F41" w:themeColor="accent1" w:themeShade="80"/>
+              </w:rPr>
+            </w:pPr>
+            <w:r>
+              <w:rPr>
+                <w:rFonts w:ascii="Arial" w:hAnsi="Arial" w:cs="Arial"/>
+                <w:b/>
+                <w:bCs/>
+                <w:color w:val="0A2F41" w:themeColor="accent1" w:themeShade="80"/>
+              </w:rPr>
+              <w:t>0.576</w:t>
+            </w:r>
+          </w:p>
+        </w:tc>
+        <w:tc>
+          <w:tcPr>
+            <w:tcW w:w="0" w:type="auto"/>
+            <w:tcBorders>
+              <w:top w:val="single" w:sz="6" w:space="0" w:color="D6D6D6"/>
+              <w:left w:val="single" w:sz="6" w:space="0" w:color="D6D6D6"/>
+              <w:bottom w:val="single" w:sz="6" w:space="0" w:color="D6D6D6"/>
+              <w:right w:val="single" w:sz="6" w:space="0" w:color="D6D6D6"/>
+            </w:tcBorders>
+            <w:shd w:val="clear" w:color="auto" w:fill="FFFFFF"/>
+            <w:tcMar>
+              <w:top w:w="90" w:type="dxa"/>
+              <w:left w:w="195" w:type="dxa"/>
+              <w:bottom w:w="90" w:type="dxa"/>
+              <w:right w:w="195" w:type="dxa"/>
+            </w:tcMar>
+            <w:vAlign w:val="center"/>
+            <w:hideMark/>
+          </w:tcPr>
+          <w:p>
+            <w:pPr>
+              <w:jc w:val="both"/>
+              <w:rPr>
+                <w:rFonts w:ascii="Arial" w:hAnsi="Arial" w:cs="Arial"/>
+                <w:color w:val="0A2F41" w:themeColor="accent1" w:themeShade="80"/>
+              </w:rPr>
+            </w:pPr>
+            <w:r>
+              <w:rPr>
+                <w:rFonts w:ascii="Arial" w:hAnsi="Arial" w:cs="Arial"/>
+                <w:color w:val="0A2F41" w:themeColor="accent1" w:themeShade="80"/>
+              </w:rPr>
+              <w:t>0.441</w:t>
+            </w:r>
+          </w:p>
+        </w:tc>
+        <w:tc>
+          <w:tcPr>
+            <w:tcW w:w="0" w:type="auto"/>
+            <w:tcBorders>
+              <w:top w:val="single" w:sz="6" w:space="0" w:color="D6D6D6"/>
+              <w:left w:val="single" w:sz="6" w:space="0" w:color="D6D6D6"/>
+              <w:bottom w:val="single" w:sz="6" w:space="0" w:color="D6D6D6"/>
+              <w:right w:val="single" w:sz="6" w:space="0" w:color="D6D6D6"/>
+            </w:tcBorders>
+            <w:shd w:val="clear" w:color="auto" w:fill="FFFFFF"/>
+            <w:tcMar>
+              <w:top w:w="90" w:type="dxa"/>
+              <w:left w:w="195" w:type="dxa"/>
+              <w:bottom w:w="90" w:type="dxa"/>
+              <w:right w:w="195" w:type="dxa"/>
+            </w:tcMar>
+            <w:vAlign w:val="center"/>
+            <w:hideMark/>
+          </w:tcPr>
+          <w:p>
+            <w:pPr>
+              <w:jc w:val="both"/>
+              <w:rPr>
+                <w:rFonts w:ascii="Arial" w:hAnsi="Arial" w:cs="Arial"/>
+                <w:color w:val="0A2F41" w:themeColor="accent1" w:themeShade="80"/>
+              </w:rPr>
+            </w:pPr>
+            <w:r>
+              <w:rPr>
+                <w:rFonts w:ascii="Arial" w:hAnsi="Arial" w:cs="Arial"/>
+                <w:color w:val="0A2F41" w:themeColor="accent1" w:themeShade="80"/>
+              </w:rPr>
+              <w:t>0.731</w:t>
+            </w:r>
+          </w:p>
+        </w:tc>
+      </w:tr>
+      <w:tr>
+        <w:trPr>
+          <w:trHeight w:val="404"/>
+        </w:trPr>
+        <w:tc>
+          <w:tcPr>
+            <w:tcW w:w="0" w:type="auto"/>
+            <w:tcBorders>
+              <w:top w:val="single" w:sz="6" w:space="0" w:color="D6D6D6"/>
+              <w:left w:val="single" w:sz="6" w:space="0" w:color="D6D6D6"/>
+              <w:bottom w:val="single" w:sz="6" w:space="0" w:color="D6D6D6"/>
+              <w:right w:val="single" w:sz="6" w:space="0" w:color="D6D6D6"/>
+            </w:tcBorders>
+            <w:shd w:val="clear" w:color="auto" w:fill="FFFFFF"/>
+            <w:tcMar>
+              <w:top w:w="90" w:type="dxa"/>
+              <w:left w:w="195" w:type="dxa"/>
+              <w:bottom w:w="90" w:type="dxa"/>
+              <w:right w:w="195" w:type="dxa"/>
+            </w:tcMar>
+            <w:vAlign w:val="center"/>
+            <w:hideMark/>
+          </w:tcPr>
+          <w:p>
+            <w:pPr>
+              <w:jc w:val="both"/>
+              <w:rPr>
+                <w:rFonts w:ascii="Arial" w:hAnsi="Arial" w:cs="Arial"/>
+                <w:color w:val="0A2F41" w:themeColor="accent1" w:themeShade="80"/>
+              </w:rPr>
+            </w:pPr>
+            <w:proofErr w:type="spellStart"/>
+            <w:r>
+              <w:rPr>
+                <w:rFonts w:ascii="Arial" w:hAnsi="Arial" w:cs="Arial"/>
+                <w:color w:val="0A2F41" w:themeColor="accent1" w:themeShade="80"/>
+              </w:rPr>
+              <w:lastRenderedPageBreak/>
+              <w:t>Mid</w:t>
+            </w:r>
+            <w:proofErr w:type="spellEnd"/>
+          </w:p>
+        </w:tc>
+        <w:tc>
+          <w:tcPr>
+            <w:tcW w:w="0" w:type="auto"/>
+            <w:tcBorders>
+              <w:top w:val="single" w:sz="6" w:space="0" w:color="D6D6D6"/>
+              <w:left w:val="single" w:sz="6" w:space="0" w:color="D6D6D6"/>
+              <w:bottom w:val="single" w:sz="6" w:space="0" w:color="D6D6D6"/>
+              <w:right w:val="single" w:sz="6" w:space="0" w:color="D6D6D6"/>
+            </w:tcBorders>
+            <w:shd w:val="clear" w:color="auto" w:fill="FFFFFF"/>
+            <w:tcMar>
+              <w:top w:w="90" w:type="dxa"/>
+              <w:left w:w="195" w:type="dxa"/>
+              <w:bottom w:w="90" w:type="dxa"/>
+              <w:right w:w="195" w:type="dxa"/>
+            </w:tcMar>
+            <w:vAlign w:val="center"/>
+            <w:hideMark/>
+          </w:tcPr>
+          <w:p>
+            <w:pPr>
+              <w:jc w:val="both"/>
+              <w:rPr>
+                <w:rFonts w:ascii="Arial" w:hAnsi="Arial" w:cs="Arial"/>
+                <w:color w:val="0A2F41" w:themeColor="accent1" w:themeShade="80"/>
+              </w:rPr>
+            </w:pPr>
+            <w:r>
+              <w:rPr>
+                <w:rFonts w:ascii="Arial" w:hAnsi="Arial" w:cs="Arial"/>
+                <w:color w:val="0A2F41" w:themeColor="accent1" w:themeShade="80"/>
+              </w:rPr>
+              <w:t>≤ 31</w:t>
+            </w:r>
+          </w:p>
+        </w:tc>
+        <w:tc>
+          <w:tcPr>
+            <w:tcW w:w="0" w:type="auto"/>
+            <w:tcBorders>
+              <w:top w:val="single" w:sz="6" w:space="0" w:color="D6D6D6"/>
+              <w:left w:val="single" w:sz="6" w:space="0" w:color="D6D6D6"/>
+              <w:bottom w:val="single" w:sz="6" w:space="0" w:color="D6D6D6"/>
+              <w:right w:val="single" w:sz="6" w:space="0" w:color="D6D6D6"/>
+            </w:tcBorders>
+            <w:shd w:val="clear" w:color="auto" w:fill="FFFFFF"/>
+            <w:tcMar>
+              <w:top w:w="90" w:type="dxa"/>
+              <w:left w:w="195" w:type="dxa"/>
+              <w:bottom w:w="90" w:type="dxa"/>
+              <w:right w:w="195" w:type="dxa"/>
+            </w:tcMar>
+            <w:vAlign w:val="center"/>
+            <w:hideMark/>
+          </w:tcPr>
+          <w:p>
+            <w:pPr>
+              <w:jc w:val="both"/>
+              <w:rPr>
+                <w:rFonts w:ascii="Arial" w:hAnsi="Arial" w:cs="Arial"/>
+                <w:color w:val="0A2F41" w:themeColor="accent1" w:themeShade="80"/>
+              </w:rPr>
+            </w:pPr>
+            <w:r>
+              <w:rPr>
+                <w:rFonts w:ascii="Arial" w:hAnsi="Arial" w:cs="Arial"/>
+                <w:color w:val="0A2F41" w:themeColor="accent1" w:themeShade="80"/>
+              </w:rPr>
+              <w:t>100</w:t>
+            </w:r>
+          </w:p>
+        </w:tc>
+        <w:tc>
+          <w:tcPr>
+            <w:tcW w:w="0" w:type="auto"/>
+            <w:tcBorders>
+              <w:top w:val="single" w:sz="6" w:space="0" w:color="D6D6D6"/>
+              <w:left w:val="single" w:sz="6" w:space="0" w:color="D6D6D6"/>
+              <w:bottom w:val="single" w:sz="6" w:space="0" w:color="D6D6D6"/>
+              <w:right w:val="single" w:sz="6" w:space="0" w:color="D6D6D6"/>
+            </w:tcBorders>
+            <w:shd w:val="clear" w:color="auto" w:fill="FFFFFF"/>
+            <w:tcMar>
+              <w:top w:w="90" w:type="dxa"/>
+              <w:left w:w="195" w:type="dxa"/>
+              <w:bottom w:w="90" w:type="dxa"/>
+              <w:right w:w="195" w:type="dxa"/>
+            </w:tcMar>
+            <w:vAlign w:val="center"/>
+            <w:hideMark/>
+          </w:tcPr>
+          <w:p>
+            <w:pPr>
+              <w:jc w:val="both"/>
+              <w:rPr>
+                <w:rFonts w:ascii="Arial" w:hAnsi="Arial" w:cs="Arial"/>
+                <w:color w:val="0A2F41" w:themeColor="accent1" w:themeShade="80"/>
+              </w:rPr>
+            </w:pPr>
+            <w:r>
+              <w:rPr>
+                <w:rFonts w:ascii="Arial" w:hAnsi="Arial" w:cs="Arial"/>
+                <w:b/>
+                <w:bCs/>
+                <w:color w:val="0A2F41" w:themeColor="accent1" w:themeShade="80"/>
+              </w:rPr>
+              <w:t>0.803</w:t>
+            </w:r>
+          </w:p>
+        </w:tc>
+        <w:tc>
+          <w:tcPr>
+            <w:tcW w:w="0" w:type="auto"/>
+            <w:tcBorders>
+              <w:top w:val="single" w:sz="6" w:space="0" w:color="D6D6D6"/>
+              <w:left w:val="single" w:sz="6" w:space="0" w:color="D6D6D6"/>
+              <w:bottom w:val="single" w:sz="6" w:space="0" w:color="D6D6D6"/>
+              <w:right w:val="single" w:sz="6" w:space="0" w:color="D6D6D6"/>
+            </w:tcBorders>
+            <w:shd w:val="clear" w:color="auto" w:fill="FFFFFF"/>
+            <w:tcMar>
+              <w:top w:w="90" w:type="dxa"/>
+              <w:left w:w="195" w:type="dxa"/>
+              <w:bottom w:w="90" w:type="dxa"/>
+              <w:right w:w="195" w:type="dxa"/>
+            </w:tcMar>
+            <w:vAlign w:val="center"/>
+            <w:hideMark/>
+          </w:tcPr>
+          <w:p>
+            <w:pPr>
+              <w:jc w:val="both"/>
+              <w:rPr>
+                <w:rFonts w:ascii="Arial" w:hAnsi="Arial" w:cs="Arial"/>
+                <w:color w:val="0A2F41" w:themeColor="accent1" w:themeShade="80"/>
+              </w:rPr>
+            </w:pPr>
+            <w:r>
+              <w:rPr>
+                <w:rFonts w:ascii="Arial" w:hAnsi="Arial" w:cs="Arial"/>
+                <w:color w:val="0A2F41" w:themeColor="accent1" w:themeShade="80"/>
+              </w:rPr>
+              <w:t>0.560</w:t>
+            </w:r>
+          </w:p>
+        </w:tc>
+        <w:tc>
+          <w:tcPr>
+            <w:tcW w:w="0" w:type="auto"/>
+            <w:tcBorders>
+              <w:top w:val="single" w:sz="6" w:space="0" w:color="D6D6D6"/>
+              <w:left w:val="single" w:sz="6" w:space="0" w:color="D6D6D6"/>
+              <w:bottom w:val="single" w:sz="6" w:space="0" w:color="D6D6D6"/>
+              <w:right w:val="single" w:sz="6" w:space="0" w:color="D6D6D6"/>
+            </w:tcBorders>
+            <w:shd w:val="clear" w:color="auto" w:fill="FFFFFF"/>
+            <w:tcMar>
+              <w:top w:w="90" w:type="dxa"/>
+              <w:left w:w="195" w:type="dxa"/>
+              <w:bottom w:w="90" w:type="dxa"/>
+              <w:right w:w="195" w:type="dxa"/>
+            </w:tcMar>
+            <w:vAlign w:val="center"/>
+            <w:hideMark/>
+          </w:tcPr>
+          <w:p>
+            <w:pPr>
+              <w:jc w:val="both"/>
+              <w:rPr>
+                <w:rFonts w:ascii="Arial" w:hAnsi="Arial" w:cs="Arial"/>
+                <w:color w:val="0A2F41" w:themeColor="accent1" w:themeShade="80"/>
+              </w:rPr>
+            </w:pPr>
+            <w:r>
+              <w:rPr>
+                <w:rFonts w:ascii="Arial" w:hAnsi="Arial" w:cs="Arial"/>
+                <w:color w:val="0A2F41" w:themeColor="accent1" w:themeShade="80"/>
+              </w:rPr>
+              <w:t>0.760</w:t>
+            </w:r>
+          </w:p>
+        </w:tc>
+      </w:tr>
+      <w:tr>
+        <w:trPr>
+          <w:trHeight w:val="404"/>
+        </w:trPr>
+        <w:tc>
+          <w:tcPr>
+            <w:tcW w:w="0" w:type="auto"/>
+            <w:tcBorders>
+              <w:top w:val="single" w:sz="6" w:space="0" w:color="D6D6D6"/>
+              <w:left w:val="single" w:sz="6" w:space="0" w:color="D6D6D6"/>
+              <w:bottom w:val="single" w:sz="6" w:space="0" w:color="D6D6D6"/>
+              <w:right w:val="single" w:sz="6" w:space="0" w:color="D6D6D6"/>
+            </w:tcBorders>
+            <w:shd w:val="clear" w:color="auto" w:fill="FFFFFF"/>
+            <w:tcMar>
+              <w:top w:w="90" w:type="dxa"/>
+              <w:left w:w="195" w:type="dxa"/>
+              <w:bottom w:w="90" w:type="dxa"/>
+              <w:right w:w="195" w:type="dxa"/>
+            </w:tcMar>
+            <w:vAlign w:val="center"/>
+            <w:hideMark/>
+          </w:tcPr>
+          <w:p>
+            <w:pPr>
+              <w:jc w:val="both"/>
+              <w:rPr>
+                <w:rFonts w:ascii="Arial" w:hAnsi="Arial" w:cs="Arial"/>
+                <w:color w:val="0A2F41" w:themeColor="accent1" w:themeShade="80"/>
+              </w:rPr>
+            </w:pPr>
+            <w:r>
+              <w:rPr>
+                <w:rFonts w:ascii="Arial" w:hAnsi="Arial" w:cs="Arial"/>
+                <w:color w:val="0A2F41" w:themeColor="accent1" w:themeShade="80"/>
+              </w:rPr>
+              <w:t>Late</w:t>
+            </w:r>
+          </w:p>
+        </w:tc>
+        <w:tc>
+          <w:tcPr>
+            <w:tcW w:w="0" w:type="auto"/>
+            <w:tcBorders>
+              <w:top w:val="single" w:sz="6" w:space="0" w:color="D6D6D6"/>
+              <w:left w:val="single" w:sz="6" w:space="0" w:color="D6D6D6"/>
+              <w:bottom w:val="single" w:sz="6" w:space="0" w:color="D6D6D6"/>
+              <w:right w:val="single" w:sz="6" w:space="0" w:color="D6D6D6"/>
+            </w:tcBorders>
+            <w:shd w:val="clear" w:color="auto" w:fill="FFFFFF"/>
+            <w:tcMar>
+              <w:top w:w="90" w:type="dxa"/>
+              <w:left w:w="195" w:type="dxa"/>
+              <w:bottom w:w="90" w:type="dxa"/>
+              <w:right w:w="195" w:type="dxa"/>
+            </w:tcMar>
+            <w:vAlign w:val="center"/>
+            <w:hideMark/>
+          </w:tcPr>
+          <w:p>
+            <w:pPr>
+              <w:jc w:val="both"/>
+              <w:rPr>
+                <w:rFonts w:ascii="Arial" w:hAnsi="Arial" w:cs="Arial"/>
+                <w:color w:val="0A2F41" w:themeColor="accent1" w:themeShade="80"/>
+              </w:rPr>
+            </w:pPr>
+            <w:r>
+              <w:rPr>
+                <w:rFonts w:ascii="Arial" w:hAnsi="Arial" w:cs="Arial"/>
+                <w:color w:val="0A2F41" w:themeColor="accent1" w:themeShade="80"/>
+              </w:rPr>
+              <w:t>&gt; 31</w:t>
+            </w:r>
+          </w:p>
+        </w:tc>
+        <w:tc>
+          <w:tcPr>
+            <w:tcW w:w="0" w:type="auto"/>
+            <w:tcBorders>
+              <w:top w:val="single" w:sz="6" w:space="0" w:color="D6D6D6"/>
+              <w:left w:val="single" w:sz="6" w:space="0" w:color="D6D6D6"/>
+              <w:bottom w:val="single" w:sz="6" w:space="0" w:color="D6D6D6"/>
+              <w:right w:val="single" w:sz="6" w:space="0" w:color="D6D6D6"/>
+            </w:tcBorders>
+            <w:shd w:val="clear" w:color="auto" w:fill="FFFFFF"/>
+            <w:tcMar>
+              <w:top w:w="90" w:type="dxa"/>
+              <w:left w:w="195" w:type="dxa"/>
+              <w:bottom w:w="90" w:type="dxa"/>
+              <w:right w:w="195" w:type="dxa"/>
+            </w:tcMar>
+            <w:vAlign w:val="center"/>
+            <w:hideMark/>
+          </w:tcPr>
+          <w:p>
+            <w:pPr>
+              <w:jc w:val="both"/>
+              <w:rPr>
+                <w:rFonts w:ascii="Arial" w:hAnsi="Arial" w:cs="Arial"/>
+                <w:color w:val="0A2F41" w:themeColor="accent1" w:themeShade="80"/>
+              </w:rPr>
+            </w:pPr>
+            <w:r>
+              <w:rPr>
+                <w:rFonts w:ascii="Arial" w:hAnsi="Arial" w:cs="Arial"/>
+                <w:color w:val="0A2F41" w:themeColor="accent1" w:themeShade="80"/>
+              </w:rPr>
+              <w:t>97</w:t>
+            </w:r>
+          </w:p>
+        </w:tc>
+        <w:tc>
+          <w:tcPr>
+            <w:tcW w:w="0" w:type="auto"/>
+            <w:tcBorders>
+              <w:top w:val="single" w:sz="6" w:space="0" w:color="D6D6D6"/>
+              <w:left w:val="single" w:sz="6" w:space="0" w:color="D6D6D6"/>
+              <w:bottom w:val="single" w:sz="6" w:space="0" w:color="D6D6D6"/>
+              <w:right w:val="single" w:sz="6" w:space="0" w:color="D6D6D6"/>
+            </w:tcBorders>
+            <w:shd w:val="clear" w:color="auto" w:fill="FFFFFF"/>
+            <w:tcMar>
+              <w:top w:w="90" w:type="dxa"/>
+              <w:left w:w="195" w:type="dxa"/>
+              <w:bottom w:w="90" w:type="dxa"/>
+              <w:right w:w="195" w:type="dxa"/>
+            </w:tcMar>
+            <w:vAlign w:val="center"/>
+            <w:hideMark/>
+          </w:tcPr>
+          <w:p>
+            <w:pPr>
+              <w:jc w:val="both"/>
+              <w:rPr>
+                <w:rFonts w:ascii="Arial" w:hAnsi="Arial" w:cs="Arial"/>
+                <w:color w:val="0A2F41" w:themeColor="accent1" w:themeShade="80"/>
+              </w:rPr>
+            </w:pPr>
+            <w:r>
+              <w:rPr>
+                <w:rFonts w:ascii="Arial" w:hAnsi="Arial" w:cs="Arial"/>
+                <w:b/>
+                <w:bCs/>
+                <w:color w:val="0A2F41" w:themeColor="accent1" w:themeShade="80"/>
+              </w:rPr>
+              <w:t>0.962</w:t>
+            </w:r>
+          </w:p>
+        </w:tc>
+        <w:tc>
+          <w:tcPr>
+            <w:tcW w:w="0" w:type="auto"/>
+            <w:tcBorders>
+              <w:top w:val="single" w:sz="6" w:space="0" w:color="D6D6D6"/>
+              <w:left w:val="single" w:sz="6" w:space="0" w:color="D6D6D6"/>
+              <w:bottom w:val="single" w:sz="6" w:space="0" w:color="D6D6D6"/>
+              <w:right w:val="single" w:sz="6" w:space="0" w:color="D6D6D6"/>
+            </w:tcBorders>
+            <w:shd w:val="clear" w:color="auto" w:fill="FFFFFF"/>
+            <w:tcMar>
+              <w:top w:w="90" w:type="dxa"/>
+              <w:left w:w="195" w:type="dxa"/>
+              <w:bottom w:w="90" w:type="dxa"/>
+              <w:right w:w="195" w:type="dxa"/>
+            </w:tcMar>
+            <w:vAlign w:val="center"/>
+            <w:hideMark/>
+          </w:tcPr>
+          <w:p>
+            <w:pPr>
+              <w:jc w:val="both"/>
+              <w:rPr>
+                <w:rFonts w:ascii="Arial" w:hAnsi="Arial" w:cs="Arial"/>
+                <w:color w:val="0A2F41" w:themeColor="accent1" w:themeShade="80"/>
+              </w:rPr>
+            </w:pPr>
+            <w:r>
+              <w:rPr>
+                <w:rFonts w:ascii="Arial" w:hAnsi="Arial" w:cs="Arial"/>
+                <w:color w:val="0A2F41" w:themeColor="accent1" w:themeShade="80"/>
+              </w:rPr>
+              <w:t>1.000</w:t>
+            </w:r>
+          </w:p>
+        </w:tc>
+        <w:tc>
+          <w:tcPr>
+            <w:tcW w:w="0" w:type="auto"/>
+            <w:tcBorders>
+              <w:top w:val="single" w:sz="6" w:space="0" w:color="D6D6D6"/>
+              <w:left w:val="single" w:sz="6" w:space="0" w:color="D6D6D6"/>
+              <w:bottom w:val="single" w:sz="6" w:space="0" w:color="D6D6D6"/>
+              <w:right w:val="single" w:sz="6" w:space="0" w:color="D6D6D6"/>
+            </w:tcBorders>
+            <w:shd w:val="clear" w:color="auto" w:fill="FFFFFF"/>
+            <w:tcMar>
+              <w:top w:w="90" w:type="dxa"/>
+              <w:left w:w="195" w:type="dxa"/>
+              <w:bottom w:w="90" w:type="dxa"/>
+              <w:right w:w="195" w:type="dxa"/>
+            </w:tcMar>
+            <w:vAlign w:val="center"/>
+            <w:hideMark/>
+          </w:tcPr>
+          <w:p>
+            <w:pPr>
+              <w:jc w:val="both"/>
+              <w:rPr>
+                <w:rFonts w:ascii="Arial" w:hAnsi="Arial" w:cs="Arial"/>
+                <w:color w:val="0A2F41" w:themeColor="accent1" w:themeShade="80"/>
+              </w:rPr>
+            </w:pPr>
+            <w:r>
+              <w:rPr>
+                <w:rFonts w:ascii="Arial" w:hAnsi="Arial" w:cs="Arial"/>
+                <w:color w:val="0A2F41" w:themeColor="accent1" w:themeShade="80"/>
+              </w:rPr>
+              <w:t>0.900</w:t>
+            </w:r>
+          </w:p>
+        </w:tc>
+      </w:tr>
+    </w:tbl>
+    <w:p>
+      <w:pPr>
+        <w:jc w:val="both"/>
+        <w:rPr>
+          <w:rFonts w:ascii="Arial" w:hAnsi="Arial" w:cs="Arial"/>
+          <w:color w:val="0A2F41" w:themeColor="accent1" w:themeShade="80"/>
+          <w:lang w:val="en-US"/>
+        </w:rPr>
+      </w:pPr>
+    </w:p>
+    <w:p>
+      <w:pPr>
+        <w:jc w:val="both"/>
+        <w:rPr>
+          <w:rFonts w:ascii="Arial" w:hAnsi="Arial" w:cs="Arial"/>
+          <w:b/>
+          <w:bCs/>
+          <w:lang w:val="en-US"/>
+        </w:rPr>
+      </w:pPr>
+      <w:r>
+        <w:rPr>
+          <w:rFonts w:ascii="Arial" w:hAnsi="Arial" w:cs="Arial"/>
+          <w:b/>
+          <w:bCs/>
+          <w:lang w:val="en-US"/>
+        </w:rPr>
+        <w:t xml:space="preserve">2. The author should explicitly clarify if metrics in table 1 were calculated at the level of individual MRI exams or at animal level.  </w:t>
+      </w:r>
+    </w:p>
+    <w:p>
+      <w:pPr>
+        <w:jc w:val="both"/>
+        <w:rPr>
+          <w:rFonts w:ascii="Arial" w:hAnsi="Arial" w:cs="Arial"/>
+          <w:lang w:val="en-US"/>
+        </w:rPr>
+      </w:pPr>
+      <w:r>
+        <w:rPr>
+          <w:rFonts w:ascii="Arial" w:hAnsi="Arial" w:cs="Arial"/>
+          <w:lang w:val="en-US"/>
+        </w:rPr>
+        <w:t>- The manuscript stated that “</w:t>
+      </w:r>
+      <w:proofErr w:type="spellStart"/>
+      <w:r>
+        <w:rPr>
+          <w:rFonts w:ascii="Arial" w:hAnsi="Arial" w:cs="Arial"/>
+          <w:lang w:val="en-US"/>
+        </w:rPr>
+        <w:t>EfficientNet</w:t>
+      </w:r>
+      <w:proofErr w:type="spellEnd"/>
+      <w:r>
+        <w:rPr>
+          <w:rFonts w:ascii="Arial" w:hAnsi="Arial" w:cs="Arial"/>
+          <w:lang w:val="en-US"/>
+        </w:rPr>
+        <w:t xml:space="preserve"> correctly identified 90.9% of cured animals compared with 51.5% for </w:t>
+      </w:r>
+      <w:proofErr w:type="spellStart"/>
+      <w:r>
+        <w:rPr>
+          <w:rFonts w:ascii="Arial" w:hAnsi="Arial" w:cs="Arial"/>
+          <w:lang w:val="en-US"/>
+        </w:rPr>
+        <w:t>XGBoost</w:t>
+      </w:r>
+      <w:proofErr w:type="spellEnd"/>
+      <w:r>
+        <w:rPr>
+          <w:rFonts w:ascii="Arial" w:hAnsi="Arial" w:cs="Arial"/>
+          <w:lang w:val="en-US"/>
+        </w:rPr>
+        <w:t xml:space="preserve">”, but these numbers </w:t>
+      </w:r>
+      <w:proofErr w:type="gramStart"/>
+      <w:r>
+        <w:rPr>
+          <w:rFonts w:ascii="Arial" w:hAnsi="Arial" w:cs="Arial"/>
+          <w:lang w:val="en-US"/>
+        </w:rPr>
+        <w:t>does</w:t>
+      </w:r>
+      <w:proofErr w:type="gramEnd"/>
+      <w:r>
+        <w:rPr>
+          <w:rFonts w:ascii="Arial" w:hAnsi="Arial" w:cs="Arial"/>
+          <w:lang w:val="en-US"/>
+        </w:rPr>
+        <w:t xml:space="preserve"> not look like they represent subject-level sensitivity. Please explicitly define the unit used for every reported performance metric. If the current metrics are examination-level, the wording should be corrected accordingly. I strongly recommend </w:t>
+      </w:r>
+      <w:proofErr w:type="gramStart"/>
+      <w:r>
+        <w:rPr>
+          <w:rFonts w:ascii="Arial" w:hAnsi="Arial" w:cs="Arial"/>
+          <w:lang w:val="en-US"/>
+        </w:rPr>
+        <w:t>report</w:t>
+      </w:r>
+      <w:proofErr w:type="gramEnd"/>
+      <w:r>
+        <w:rPr>
+          <w:rFonts w:ascii="Arial" w:hAnsi="Arial" w:cs="Arial"/>
+          <w:lang w:val="en-US"/>
+        </w:rPr>
+        <w:t xml:space="preserve"> subject-level performance because that is </w:t>
+      </w:r>
+      <w:proofErr w:type="gramStart"/>
+      <w:r>
+        <w:rPr>
+          <w:rFonts w:ascii="Arial" w:hAnsi="Arial" w:cs="Arial"/>
+          <w:lang w:val="en-US"/>
+        </w:rPr>
+        <w:t>a more</w:t>
+      </w:r>
+      <w:proofErr w:type="gramEnd"/>
+      <w:r>
+        <w:rPr>
+          <w:rFonts w:ascii="Arial" w:hAnsi="Arial" w:cs="Arial"/>
+          <w:lang w:val="en-US"/>
+        </w:rPr>
+        <w:t xml:space="preserve"> interesting than exam-level performance. </w:t>
+      </w:r>
+    </w:p>
+    <w:p>
+      <w:pPr>
+        <w:jc w:val="both"/>
+        <w:rPr>
+          <w:rFonts w:ascii="Arial" w:hAnsi="Arial" w:cs="Arial"/>
+          <w:b/>
+          <w:bCs/>
+          <w:lang w:val="en-US"/>
+        </w:rPr>
+      </w:pPr>
+      <w:r>
+        <w:rPr>
+          <w:rFonts w:ascii="Arial" w:hAnsi="Arial" w:cs="Arial"/>
+          <w:b/>
+          <w:bCs/>
+          <w:lang w:val="en-US"/>
+        </w:rPr>
+        <w:t xml:space="preserve">3. The manuscript overstates the evidence for early prediction performance without </w:t>
+      </w:r>
+      <w:proofErr w:type="gramStart"/>
+      <w:r>
+        <w:rPr>
+          <w:rFonts w:ascii="Arial" w:hAnsi="Arial" w:cs="Arial"/>
+          <w:b/>
+          <w:bCs/>
+          <w:lang w:val="en-US"/>
+        </w:rPr>
+        <w:t>actually showing</w:t>
+      </w:r>
+      <w:proofErr w:type="gramEnd"/>
+      <w:r>
+        <w:rPr>
+          <w:rFonts w:ascii="Arial" w:hAnsi="Arial" w:cs="Arial"/>
+          <w:b/>
+          <w:bCs/>
+          <w:lang w:val="en-US"/>
+        </w:rPr>
+        <w:t xml:space="preserve"> it. </w:t>
+      </w:r>
+    </w:p>
+    <w:p>
+      <w:pPr>
+        <w:jc w:val="both"/>
+        <w:rPr>
+          <w:rFonts w:ascii="Arial" w:hAnsi="Arial" w:cs="Arial"/>
+          <w:lang w:val="en-US"/>
+        </w:rPr>
+      </w:pPr>
+      <w:r>
+        <w:rPr>
+          <w:rFonts w:ascii="Arial" w:hAnsi="Arial" w:cs="Arial"/>
+          <w:lang w:val="en-US"/>
+        </w:rPr>
+        <w:t xml:space="preserve"> - The temporal analysis shows that errors vary with study day, but the main AUC is calculated across examinations from the full follow-up period. Therefore, the reported AUC does not establish predictive performance specifically during early treatment. The authors should either report performance within clearly defined early treatment windows using the existing data or revise the conclusions to avoid claiming good early prediction performance. </w:t>
+      </w:r>
+    </w:p>
+    <w:p>
+      <w:pPr>
+        <w:jc w:val="both"/>
+        <w:rPr>
+          <w:rFonts w:ascii="Arial" w:hAnsi="Arial" w:cs="Arial"/>
+          <w:b/>
+          <w:bCs/>
+          <w:lang w:val="en-US"/>
+        </w:rPr>
+      </w:pPr>
+      <w:r>
+        <w:rPr>
+          <w:rFonts w:ascii="Arial" w:hAnsi="Arial" w:cs="Arial"/>
+          <w:b/>
+          <w:bCs/>
+          <w:lang w:val="en-US"/>
+        </w:rPr>
+        <w:t xml:space="preserve">4. Several conclusions should be rewritten to match the reported results more precisely </w:t>
+      </w:r>
+    </w:p>
+    <w:p>
+      <w:pPr>
+        <w:jc w:val="both"/>
+        <w:rPr>
+          <w:rFonts w:ascii="Arial" w:hAnsi="Arial" w:cs="Arial"/>
+          <w:lang w:val="en-US"/>
+        </w:rPr>
+      </w:pPr>
+      <w:r>
+        <w:rPr>
+          <w:rFonts w:ascii="Arial" w:hAnsi="Arial" w:cs="Arial"/>
+          <w:lang w:val="en-US"/>
+        </w:rPr>
+        <w:t xml:space="preserve">- Radiomics showed higher Specificity and PPV, so DL model did not </w:t>
+      </w:r>
+      <w:proofErr w:type="gramStart"/>
+      <w:r>
+        <w:rPr>
+          <w:rFonts w:ascii="Arial" w:hAnsi="Arial" w:cs="Arial"/>
+          <w:lang w:val="en-US"/>
+        </w:rPr>
+        <w:t>outperformed</w:t>
+      </w:r>
+      <w:proofErr w:type="gramEnd"/>
+      <w:r>
+        <w:rPr>
+          <w:rFonts w:ascii="Arial" w:hAnsi="Arial" w:cs="Arial"/>
+          <w:lang w:val="en-US"/>
+        </w:rPr>
+        <w:t xml:space="preserve"> </w:t>
+      </w:r>
+      <w:proofErr w:type="gramStart"/>
+      <w:r>
+        <w:rPr>
+          <w:rFonts w:ascii="Arial" w:hAnsi="Arial" w:cs="Arial"/>
+          <w:lang w:val="en-US"/>
+        </w:rPr>
+        <w:t>radiomics approach</w:t>
+      </w:r>
+      <w:proofErr w:type="gramEnd"/>
+      <w:r>
+        <w:rPr>
+          <w:rFonts w:ascii="Arial" w:hAnsi="Arial" w:cs="Arial"/>
+          <w:lang w:val="en-US"/>
+        </w:rPr>
+        <w:t xml:space="preserve"> across all metrics as stated in the abstract. It should be “most” or the majority of. - You chose AUC to be the main metric, but </w:t>
+      </w:r>
+      <w:proofErr w:type="spellStart"/>
+      <w:r>
+        <w:rPr>
+          <w:rFonts w:ascii="Arial" w:hAnsi="Arial" w:cs="Arial"/>
+          <w:lang w:val="en-US"/>
+        </w:rPr>
+        <w:t>EfficientNet</w:t>
+      </w:r>
+      <w:proofErr w:type="spellEnd"/>
+      <w:r>
+        <w:rPr>
+          <w:rFonts w:ascii="Arial" w:hAnsi="Arial" w:cs="Arial"/>
+          <w:lang w:val="en-US"/>
+        </w:rPr>
+        <w:t xml:space="preserve"> FE + XGB has higher AUC than FT. I do agree that the FT model is overall giving more balanced classification performance. </w:t>
+      </w:r>
+    </w:p>
+    <w:p>
+      <w:pPr>
+        <w:jc w:val="both"/>
+        <w:rPr>
+          <w:rFonts w:ascii="Arial" w:hAnsi="Arial" w:cs="Arial"/>
+          <w:b/>
+          <w:bCs/>
+          <w:lang w:val="en-US"/>
+        </w:rPr>
+      </w:pPr>
+      <w:r>
+        <w:rPr>
+          <w:rFonts w:ascii="Arial" w:hAnsi="Arial" w:cs="Arial"/>
+          <w:b/>
+          <w:bCs/>
+          <w:lang w:val="en-US"/>
+        </w:rPr>
+        <w:t xml:space="preserve">5. Some important tables are missing? </w:t>
+      </w:r>
+    </w:p>
+    <w:p>
+      <w:pPr>
+        <w:jc w:val="both"/>
+        <w:rPr>
+          <w:rFonts w:ascii="Arial" w:hAnsi="Arial" w:cs="Arial"/>
+          <w:lang w:val="en-US"/>
+        </w:rPr>
+      </w:pPr>
+      <w:r>
+        <w:rPr>
+          <w:rFonts w:ascii="Arial" w:hAnsi="Arial" w:cs="Arial"/>
+          <w:lang w:val="en-US"/>
+        </w:rPr>
+        <w:t xml:space="preserve">- The authors talked about table S3/S4 for hyperparameters search but I didn’t see it in the </w:t>
+      </w:r>
+    </w:p>
+    <w:p>
+      <w:pPr>
+        <w:jc w:val="both"/>
+        <w:rPr>
+          <w:rFonts w:ascii="Arial" w:hAnsi="Arial" w:cs="Arial"/>
+          <w:lang w:val="en-US"/>
+        </w:rPr>
+      </w:pPr>
+      <w:r>
+        <w:rPr>
+          <w:rFonts w:ascii="Arial" w:hAnsi="Arial" w:cs="Arial"/>
+          <w:lang w:val="en-US"/>
+        </w:rPr>
+        <w:t xml:space="preserve">supplementary files.  </w:t>
+      </w:r>
+    </w:p>
+    <w:p>
+      <w:pPr>
+        <w:jc w:val="both"/>
+        <w:rPr>
+          <w:rFonts w:ascii="Arial" w:hAnsi="Arial" w:cs="Arial"/>
+          <w:lang w:val="en-US"/>
+        </w:rPr>
+      </w:pPr>
+      <w:r>
+        <w:rPr>
+          <w:rFonts w:ascii="Arial" w:hAnsi="Arial" w:cs="Arial"/>
+          <w:lang w:val="en-US"/>
+        </w:rPr>
+        <w:t xml:space="preserve">Minor comments </w:t>
+      </w:r>
+    </w:p>
+    <w:p>
+      <w:pPr>
+        <w:jc w:val="both"/>
+        <w:rPr>
+          <w:rFonts w:ascii="Arial" w:hAnsi="Arial" w:cs="Arial"/>
+          <w:lang w:val="en-US"/>
+        </w:rPr>
+      </w:pPr>
+      <w:r>
+        <w:rPr>
+          <w:rFonts w:ascii="Arial" w:hAnsi="Arial" w:cs="Arial"/>
+          <w:lang w:val="en-US"/>
+        </w:rPr>
+        <w:t xml:space="preserve">1. Please provide measures of uncertainty (e.g., 95% confidence intervals) for the performance </w:t>
+      </w:r>
+    </w:p>
+    <w:p>
+      <w:pPr>
+        <w:jc w:val="both"/>
+        <w:rPr>
+          <w:rFonts w:ascii="Arial" w:hAnsi="Arial" w:cs="Arial"/>
+          <w:lang w:val="en-US"/>
+        </w:rPr>
+      </w:pPr>
+      <w:r>
+        <w:rPr>
+          <w:rFonts w:ascii="Arial" w:hAnsi="Arial" w:cs="Arial"/>
+          <w:lang w:val="en-US"/>
+        </w:rPr>
+        <w:lastRenderedPageBreak/>
+        <w:t xml:space="preserve">metrics. Uncertainty estimation should account for clustering of examinations within animals </w:t>
+      </w:r>
+    </w:p>
+    <w:p>
+      <w:pPr>
+        <w:jc w:val="both"/>
+        <w:rPr>
+          <w:rFonts w:ascii="Arial" w:hAnsi="Arial" w:cs="Arial"/>
+          <w:lang w:val="en-US"/>
+        </w:rPr>
+      </w:pPr>
+      <w:r>
+        <w:rPr>
+          <w:rFonts w:ascii="Arial" w:hAnsi="Arial" w:cs="Arial"/>
+          <w:lang w:val="en-US"/>
+        </w:rPr>
+        <w:t xml:space="preserve">2. The paper acknowledges the small cohort. I recommend explicitly </w:t>
+      </w:r>
+      <w:proofErr w:type="gramStart"/>
+      <w:r>
+        <w:rPr>
+          <w:rFonts w:ascii="Arial" w:hAnsi="Arial" w:cs="Arial"/>
+          <w:lang w:val="en-US"/>
+        </w:rPr>
+        <w:t>acknowledge</w:t>
+      </w:r>
+      <w:proofErr w:type="gramEnd"/>
+      <w:r>
+        <w:rPr>
+          <w:rFonts w:ascii="Arial" w:hAnsi="Arial" w:cs="Arial"/>
+          <w:lang w:val="en-US"/>
+        </w:rPr>
+        <w:t xml:space="preserve"> that the DL </w:t>
+      </w:r>
+    </w:p>
+    <w:p>
+      <w:pPr>
+        <w:jc w:val="both"/>
+        <w:rPr>
+          <w:rFonts w:ascii="Arial" w:hAnsi="Arial" w:cs="Arial"/>
+          <w:lang w:val="en-US"/>
+        </w:rPr>
+      </w:pPr>
+      <w:r>
+        <w:rPr>
+          <w:rFonts w:ascii="Arial" w:hAnsi="Arial" w:cs="Arial"/>
+          <w:lang w:val="en-US"/>
+        </w:rPr>
+        <w:t xml:space="preserve">did not model </w:t>
+      </w:r>
+      <w:proofErr w:type="spellStart"/>
+      <w:r>
+        <w:rPr>
+          <w:rFonts w:ascii="Arial" w:hAnsi="Arial" w:cs="Arial"/>
+          <w:lang w:val="en-US"/>
+        </w:rPr>
+        <w:t>longtitudinal</w:t>
+      </w:r>
+      <w:proofErr w:type="spellEnd"/>
+      <w:r>
+        <w:rPr>
+          <w:rFonts w:ascii="Arial" w:hAnsi="Arial" w:cs="Arial"/>
+          <w:lang w:val="en-US"/>
+        </w:rPr>
+        <w:t xml:space="preserve"> sequences. The current strategy therefore uses longitudinally </w:t>
+      </w:r>
+    </w:p>
+    <w:p>
+      <w:pPr>
+        <w:jc w:val="both"/>
+        <w:rPr>
+          <w:rFonts w:ascii="Arial" w:hAnsi="Arial" w:cs="Arial"/>
+          <w:lang w:val="en-US"/>
+        </w:rPr>
+      </w:pPr>
+      <w:r>
+        <w:rPr>
+          <w:rFonts w:ascii="Arial" w:hAnsi="Arial" w:cs="Arial"/>
+          <w:lang w:val="en-US"/>
+        </w:rPr>
+        <w:t xml:space="preserve">acquired data but is not itself a temporal sequence model. </w:t>
+      </w:r>
+    </w:p>
+    <w:p>
+      <w:pPr>
+        <w:jc w:val="both"/>
+        <w:rPr>
+          <w:rFonts w:ascii="Arial" w:hAnsi="Arial" w:cs="Arial"/>
+          <w:lang w:val="en-US"/>
+        </w:rPr>
+      </w:pPr>
+      <w:r>
+        <w:rPr>
+          <w:rFonts w:ascii="Arial" w:hAnsi="Arial" w:cs="Arial"/>
+          <w:lang w:val="en-US"/>
+        </w:rPr>
+        <w:t xml:space="preserve">3. PPV is </w:t>
+      </w:r>
+      <w:proofErr w:type="gramStart"/>
+      <w:r>
+        <w:rPr>
+          <w:rFonts w:ascii="Arial" w:hAnsi="Arial" w:cs="Arial"/>
+          <w:lang w:val="en-US"/>
+        </w:rPr>
+        <w:t>pretty low</w:t>
+      </w:r>
+      <w:proofErr w:type="gramEnd"/>
+      <w:r>
+        <w:rPr>
+          <w:rFonts w:ascii="Arial" w:hAnsi="Arial" w:cs="Arial"/>
+          <w:lang w:val="en-US"/>
+        </w:rPr>
+        <w:t xml:space="preserve"> across models. This should be acknowledged because it’s an important point </w:t>
+      </w:r>
+    </w:p>
+    <w:p>
+      <w:pPr>
+        <w:jc w:val="both"/>
+        <w:rPr>
+          <w:rFonts w:ascii="Arial" w:hAnsi="Arial" w:cs="Arial"/>
+        </w:rPr>
+      </w:pPr>
+      <w:proofErr w:type="spellStart"/>
+      <w:r>
+        <w:rPr>
+          <w:rFonts w:ascii="Arial" w:hAnsi="Arial" w:cs="Arial"/>
+        </w:rPr>
+        <w:t>clinically</w:t>
+      </w:r>
+      <w:proofErr w:type="spellEnd"/>
+      <w:r>
+        <w:rPr>
+          <w:rFonts w:ascii="Arial" w:hAnsi="Arial" w:cs="Arial"/>
+        </w:rPr>
+        <w:t xml:space="preserve"> </w:t>
+      </w:r>
+      <w:proofErr w:type="spellStart"/>
+      <w:r>
+        <w:rPr>
+          <w:rFonts w:ascii="Arial" w:hAnsi="Arial" w:cs="Arial"/>
+        </w:rPr>
+        <w:t>still</w:t>
+      </w:r>
+      <w:proofErr w:type="spellEnd"/>
+      <w:r>
+        <w:rPr>
+          <w:rFonts w:ascii="Arial" w:hAnsi="Arial" w:cs="Arial"/>
+        </w:rPr>
+        <w:t>.</w:t>
+      </w:r>
+    </w:p>
     <w:sectPr>
       <w:pgSz w:w="11906" w:h="16838"/>
       <w:pgMar w:top="1417" w:right="1701" w:bottom="1417" w:left="1701" w:header="708" w:footer="708" w:gutter="0"/>
@@ -616,7 +2448,6 @@
   <w:style w:type="character" w:default="1" w:styleId="Fuentedeprrafopredeter">
     <w:name w:val="Default Paragraph Font"/>
     <w:uiPriority w:val="1"/>
-    <w:semiHidden/>
     <w:unhideWhenUsed/>
   </w:style>
   <w:style w:type="table" w:default="1" w:styleId="Tablanormal">

</xml_diff>